<commit_message>
team 1 milestone 4 update
</commit_message>
<xml_diff>
--- a/03_Team_Work/Team1/Milestone_4_Interfaces_and_Data_Structures/Part2/01_In_Progress/KS_M4_Team1_FF_ProfileImage_v01.docx
+++ b/03_Team_Work/Team1/Milestone_4_Interfaces_and_Data_Structures/Part2/01_In_Progress/KS_M4_Team1_FF_ProfileImage_v01.docx
@@ -29,8 +29,8 @@
         <w:tblLook w:val="04A0" w:firstRow="1" w:lastRow="0" w:firstColumn="1" w:lastColumn="0" w:noHBand="0" w:noVBand="1"/>
       </w:tblPr>
       <w:tblGrid>
-        <w:gridCol w:w="3111"/>
-        <w:gridCol w:w="6249"/>
+        <w:gridCol w:w="3407"/>
+        <w:gridCol w:w="5953"/>
       </w:tblGrid>
       <w:tr>
         <w:trPr>
@@ -131,7 +131,7 @@
                 <w:sz w:val="22"/>
                 <w:lang w:eastAsia="en-US"/>
               </w:rPr>
-              <w:t>Name of the file type</w:t>
+              <w:t>ProfileImage</w:t>
             </w:r>
           </w:p>
         </w:tc>
@@ -181,7 +181,7 @@
                 <w:sz w:val="22"/>
                 <w:lang w:eastAsia="en-US"/>
               </w:rPr>
-              <w:t>Why the file exists</w:t>
+              <w:t>Personalize account</w:t>
             </w:r>
           </w:p>
         </w:tc>
@@ -234,7 +234,7 @@
                 <w:sz w:val="22"/>
                 <w:lang w:eastAsia="en-US"/>
               </w:rPr>
-              <w:t>Allowed file extensions or formats</w:t>
+              <w:t>.png and .jpeg</w:t>
             </w:r>
           </w:p>
         </w:tc>
@@ -284,7 +284,7 @@
                 <w:sz w:val="22"/>
                 <w:lang w:eastAsia="en-US"/>
               </w:rPr>
-              <w:t>Where the file is stored</w:t>
+              <w:t>File blob storage</w:t>
             </w:r>
           </w:p>
         </w:tc>
@@ -337,7 +337,7 @@
                 <w:sz w:val="22"/>
                 <w:lang w:eastAsia="en-US"/>
               </w:rPr>
-              <w:t>Related system entity</w:t>
+              <w:t>Student profile</w:t>
             </w:r>
           </w:p>
         </w:tc>
@@ -387,7 +387,7 @@
                 <w:sz w:val="22"/>
                 <w:lang w:eastAsia="en-US"/>
               </w:rPr>
-              <w:t>Maximum allowed file size, if applicable</w:t>
+              <w:t>10mb</w:t>
             </w:r>
           </w:p>
         </w:tc>
@@ -440,7 +440,7 @@
                 <w:sz w:val="22"/>
                 <w:lang w:eastAsia="en-US"/>
               </w:rPr>
-              <w:t>Metadata stored with the file</w:t>
+              <w:t>File name, date uploaded and file size</w:t>
             </w:r>
           </w:p>
         </w:tc>
@@ -490,7 +490,7 @@
                 <w:sz w:val="22"/>
                 <w:lang w:eastAsia="en-US"/>
               </w:rPr>
-              <w:t>Rules applied before storing or using the file</w:t>
+              <w:t>Validate image size and file size</w:t>
             </w:r>
           </w:p>
         </w:tc>
@@ -543,7 +543,7 @@
                 <w:sz w:val="22"/>
                 <w:lang w:eastAsia="en-US"/>
               </w:rPr>
-              <w:t>Components or services that use the file</w:t>
+              <w:t>Users with the student role</w:t>
             </w:r>
           </w:p>
         </w:tc>
@@ -593,7 +593,15 @@
                 <w:sz w:val="22"/>
                 <w:lang w:eastAsia="en-US"/>
               </w:rPr>
-              <w:t>Access control or security concerns</w:t>
+              <w:t xml:space="preserve">Access </w:t>
+            </w:r>
+            <w:r>
+              <w:rPr>
+                <w:rFonts w:ascii="Arial" w:eastAsia="Times New Roman" w:hAnsi="Arial" w:cs="Arial"/>
+                <w:sz w:val="22"/>
+                <w:lang w:eastAsia="en-US"/>
+              </w:rPr>
+              <w:t>restricted to authorized users</w:t>
             </w:r>
           </w:p>
         </w:tc>

</xml_diff>